<commit_message>
Verify replication-package kit and link it from its niche
Re-ran the checker (34 findings on the original sample, none on the
fixed package) and the reproduction run (4 of 4 outputs identical).
README now says to install the package's own dependencies first.

Co-Authored-By: Claude Opus 5.5 <noreply@anthropic.com>
Claude-Session: https://claude.ai/code/session_01DspfyLwNfeJ4CHdyACeRHQ
</commit_message>
<xml_diff>
--- a/kits/cra-readiness/samples/mossbyte-sprout-s1/deliverables/handover-note.docx
+++ b/kits/cra-readiness/samples/mossbyte-sprout-s1/deliverables/handover-note.docx
@@ -105,9 +105,9 @@
         <w:tblLook w:firstColumn="1" w:firstRow="1" w:lastColumn="0" w:lastRow="0" w:noHBand="0" w:noVBand="1" w:val="04A0"/>
       </w:tblPr>
       <w:tblGrid>
-        <w:gridCol w:w="2789"/>
-        <w:gridCol w:w="2865"/>
-        <w:gridCol w:w="3984"/>
+        <w:gridCol w:w="2875"/>
+        <w:gridCol w:w="2941"/>
+        <w:gridCol w:w="3821"/>
       </w:tblGrid>
       <w:tr>
         <w:trPr>
@@ -115,7 +115,7 @@
         </w:trPr>
         <w:tc>
           <w:tcPr>
-            <w:tcW w:type="dxa" w:w="2789"/>
+            <w:tcW w:type="dxa" w:w="2875"/>
             <w:shd w:val="clear" w:color="auto" w:fill="D9E2F3"/>
           </w:tcPr>
           <w:p>
@@ -133,7 +133,7 @@
         </w:tc>
         <w:tc>
           <w:tcPr>
-            <w:tcW w:type="dxa" w:w="2865"/>
+            <w:tcW w:type="dxa" w:w="2941"/>
             <w:shd w:val="clear" w:color="auto" w:fill="D9E2F3"/>
           </w:tcPr>
           <w:p>
@@ -151,7 +151,7 @@
         </w:tc>
         <w:tc>
           <w:tcPr>
-            <w:tcW w:type="dxa" w:w="3984"/>
+            <w:tcW w:type="dxa" w:w="3821"/>
             <w:shd w:val="clear" w:color="auto" w:fill="D9E2F3"/>
           </w:tcPr>
           <w:p>
@@ -171,7 +171,7 @@
       <w:tr>
         <w:tc>
           <w:tcPr>
-            <w:tcW w:type="dxa" w:w="2789"/>
+            <w:tcW w:type="dxa" w:w="2875"/>
           </w:tcPr>
           <w:p>
             <w:pPr>
@@ -187,7 +187,7 @@
         </w:tc>
         <w:tc>
           <w:tcPr>
-            <w:tcW w:type="dxa" w:w="2865"/>
+            <w:tcW w:type="dxa" w:w="2941"/>
           </w:tcPr>
           <w:p>
             <w:pPr>
@@ -217,7 +217,7 @@
         </w:tc>
         <w:tc>
           <w:tcPr>
-            <w:tcW w:type="dxa" w:w="3984"/>
+            <w:tcW w:type="dxa" w:w="3821"/>
           </w:tcPr>
           <w:p>
             <w:pPr>
@@ -235,7 +235,7 @@
       <w:tr>
         <w:tc>
           <w:tcPr>
-            <w:tcW w:type="dxa" w:w="2789"/>
+            <w:tcW w:type="dxa" w:w="2875"/>
           </w:tcPr>
           <w:p>
             <w:pPr>
@@ -251,7 +251,7 @@
         </w:tc>
         <w:tc>
           <w:tcPr>
-            <w:tcW w:type="dxa" w:w="2865"/>
+            <w:tcW w:type="dxa" w:w="2941"/>
           </w:tcPr>
           <w:p>
             <w:pPr>
@@ -281,7 +281,7 @@
         </w:tc>
         <w:tc>
           <w:tcPr>
-            <w:tcW w:type="dxa" w:w="3984"/>
+            <w:tcW w:type="dxa" w:w="3821"/>
           </w:tcPr>
           <w:p>
             <w:pPr>
@@ -299,7 +299,7 @@
       <w:tr>
         <w:tc>
           <w:tcPr>
-            <w:tcW w:type="dxa" w:w="2789"/>
+            <w:tcW w:type="dxa" w:w="2875"/>
           </w:tcPr>
           <w:p>
             <w:pPr>
@@ -315,7 +315,7 @@
         </w:tc>
         <w:tc>
           <w:tcPr>
-            <w:tcW w:type="dxa" w:w="2865"/>
+            <w:tcW w:type="dxa" w:w="2941"/>
           </w:tcPr>
           <w:p>
             <w:pPr>
@@ -332,7 +332,7 @@
         </w:tc>
         <w:tc>
           <w:tcPr>
-            <w:tcW w:type="dxa" w:w="3984"/>
+            <w:tcW w:type="dxa" w:w="3821"/>
           </w:tcPr>
           <w:p>
             <w:pPr>
@@ -350,7 +350,7 @@
       <w:tr>
         <w:tc>
           <w:tcPr>
-            <w:tcW w:type="dxa" w:w="2789"/>
+            <w:tcW w:type="dxa" w:w="2875"/>
           </w:tcPr>
           <w:p>
             <w:pPr>
@@ -366,7 +366,7 @@
         </w:tc>
         <w:tc>
           <w:tcPr>
-            <w:tcW w:type="dxa" w:w="2865"/>
+            <w:tcW w:type="dxa" w:w="2941"/>
           </w:tcPr>
           <w:p>
             <w:pPr>
@@ -383,7 +383,7 @@
         </w:tc>
         <w:tc>
           <w:tcPr>
-            <w:tcW w:type="dxa" w:w="3984"/>
+            <w:tcW w:type="dxa" w:w="3821"/>
           </w:tcPr>
           <w:p>
             <w:pPr>
@@ -401,7 +401,7 @@
       <w:tr>
         <w:tc>
           <w:tcPr>
-            <w:tcW w:type="dxa" w:w="2789"/>
+            <w:tcW w:type="dxa" w:w="2875"/>
           </w:tcPr>
           <w:p>
             <w:pPr>
@@ -417,7 +417,7 @@
         </w:tc>
         <w:tc>
           <w:tcPr>
-            <w:tcW w:type="dxa" w:w="2865"/>
+            <w:tcW w:type="dxa" w:w="2941"/>
           </w:tcPr>
           <w:p>
             <w:pPr>
@@ -434,7 +434,7 @@
         </w:tc>
         <w:tc>
           <w:tcPr>
-            <w:tcW w:type="dxa" w:w="3984"/>
+            <w:tcW w:type="dxa" w:w="3821"/>
           </w:tcPr>
           <w:p>
             <w:pPr>
@@ -452,7 +452,7 @@
       <w:tr>
         <w:tc>
           <w:tcPr>
-            <w:tcW w:type="dxa" w:w="2789"/>
+            <w:tcW w:type="dxa" w:w="2875"/>
           </w:tcPr>
           <w:p>
             <w:pPr>
@@ -468,7 +468,7 @@
         </w:tc>
         <w:tc>
           <w:tcPr>
-            <w:tcW w:type="dxa" w:w="2865"/>
+            <w:tcW w:type="dxa" w:w="2941"/>
           </w:tcPr>
           <w:p>
             <w:pPr>
@@ -485,7 +485,7 @@
         </w:tc>
         <w:tc>
           <w:tcPr>
-            <w:tcW w:type="dxa" w:w="3984"/>
+            <w:tcW w:type="dxa" w:w="3821"/>
           </w:tcPr>
           <w:p>
             <w:pPr>
@@ -503,7 +503,7 @@
       <w:tr>
         <w:tc>
           <w:tcPr>
-            <w:tcW w:type="dxa" w:w="2789"/>
+            <w:tcW w:type="dxa" w:w="2875"/>
           </w:tcPr>
           <w:p>
             <w:pPr>
@@ -519,7 +519,7 @@
         </w:tc>
         <w:tc>
           <w:tcPr>
-            <w:tcW w:type="dxa" w:w="2865"/>
+            <w:tcW w:type="dxa" w:w="2941"/>
           </w:tcPr>
           <w:p>
             <w:pPr>
@@ -536,7 +536,7 @@
         </w:tc>
         <w:tc>
           <w:tcPr>
-            <w:tcW w:type="dxa" w:w="3984"/>
+            <w:tcW w:type="dxa" w:w="3821"/>
           </w:tcPr>
           <w:p>
             <w:pPr>
@@ -1276,7 +1276,7 @@
       <w:outlineLvl w:val="0"/>
     </w:pPr>
     <w:rPr>
-      <w:rFonts w:asciiTheme="majorHAnsi" w:eastAsiaTheme="majorEastAsia" w:hAnsiTheme="majorHAnsi" w:cstheme="majorBidi" w:ascii="Arial" w:hAnsi="Arial" w:eastAsia="Arial"/>
+      <w:rFonts w:ascii="Arial" w:hAnsi="Arial" w:eastAsia="Arial"/>
       <w:b/>
       <w:bCs/>
       <w:color w:val="1F3864"/>
@@ -1300,7 +1300,7 @@
       <w:outlineLvl w:val="1"/>
     </w:pPr>
     <w:rPr>
-      <w:rFonts w:asciiTheme="majorHAnsi" w:eastAsiaTheme="majorEastAsia" w:hAnsiTheme="majorHAnsi" w:cstheme="majorBidi" w:ascii="Arial" w:hAnsi="Arial" w:eastAsia="Arial"/>
+      <w:rFonts w:ascii="Arial" w:hAnsi="Arial" w:eastAsia="Arial"/>
       <w:b/>
       <w:bCs/>
       <w:color w:val="1F3864"/>
@@ -1324,7 +1324,7 @@
       <w:outlineLvl w:val="2"/>
     </w:pPr>
     <w:rPr>
-      <w:rFonts w:asciiTheme="majorHAnsi" w:eastAsiaTheme="majorEastAsia" w:hAnsiTheme="majorHAnsi" w:cstheme="majorBidi" w:ascii="Arial" w:hAnsi="Arial" w:eastAsia="Arial"/>
+      <w:rFonts w:ascii="Arial" w:hAnsi="Arial" w:eastAsia="Arial"/>
       <w:b/>
       <w:bCs/>
       <w:color w:val="1F3864"/>
@@ -1348,7 +1348,7 @@
       <w:outlineLvl w:val="3"/>
     </w:pPr>
     <w:rPr>
-      <w:rFonts w:asciiTheme="majorHAnsi" w:eastAsiaTheme="majorEastAsia" w:hAnsiTheme="majorHAnsi" w:cstheme="majorBidi" w:ascii="Arial" w:hAnsi="Arial" w:eastAsia="Arial"/>
+      <w:rFonts w:ascii="Arial" w:hAnsi="Arial" w:eastAsia="Arial"/>
       <w:b/>
       <w:bCs/>
       <w:i/>
@@ -1567,7 +1567,7 @@
       <w:contextualSpacing/>
     </w:pPr>
     <w:rPr>
-      <w:rFonts w:asciiTheme="majorHAnsi" w:eastAsiaTheme="majorEastAsia" w:hAnsiTheme="majorHAnsi" w:cstheme="majorBidi" w:ascii="Arial" w:hAnsi="Arial" w:eastAsia="Arial"/>
+      <w:rFonts w:ascii="Arial" w:hAnsi="Arial" w:eastAsia="Arial"/>
       <w:b/>
       <w:color w:val="1F3864"/>
       <w:spacing w:val="5"/>

</xml_diff>